<commit_message>
docs: refresh manual screenshots with live visitor count
Co-Authored-By: Claude Opus 5 <noreply@anthropic.com>
</commit_message>
<xml_diff>
--- a/docs/คู่มือการใช้งานฐานข้อมูล-HAp-Dopant-Database.docx
+++ b/docs/คู่มือการใช้งานฐานข้อมูล-HAp-Dopant-Database.docx
@@ -1266,7 +1266,7 @@
       <w:r>
         <w:drawing>
           <wp:inline>
-            <wp:extent cx="5334000" cy="3333750"/>
+            <wp:extent cx="5334000" cy="3239030"/>
             <wp:effectExtent b="0" l="0" r="0" t="0"/>
             <wp:docPr descr="" title="" id="17" name="Picture"/>
             <a:graphic>
@@ -1287,7 +1287,7 @@
                   <pic:spPr bwMode="auto">
                     <a:xfrm>
                       <a:off x="0" y="0"/>
-                      <a:ext cx="5334000" cy="3333750"/>
+                      <a:ext cx="5334000" cy="3239030"/>
                     </a:xfrm>
                     <a:prstGeom prst="rect">
                       <a:avLst/>
@@ -1361,7 +1361,7 @@
       <w:r>
         <w:drawing>
           <wp:inline>
-            <wp:extent cx="5334000" cy="3248078"/>
+            <wp:extent cx="5334000" cy="3257176"/>
             <wp:effectExtent b="0" l="0" r="0" t="0"/>
             <wp:docPr descr="" title="" id="21" name="Picture"/>
             <a:graphic>
@@ -1382,7 +1382,7 @@
                   <pic:spPr bwMode="auto">
                     <a:xfrm>
                       <a:off x="0" y="0"/>
-                      <a:ext cx="5334000" cy="3248078"/>
+                      <a:ext cx="5334000" cy="3257176"/>
                     </a:xfrm>
                     <a:prstGeom prst="rect">
                       <a:avLst/>
@@ -1500,7 +1500,7 @@
       <w:r>
         <w:drawing>
           <wp:inline>
-            <wp:extent cx="5334000" cy="4454932"/>
+            <wp:extent cx="5334000" cy="4467411"/>
             <wp:effectExtent b="0" l="0" r="0" t="0"/>
             <wp:docPr descr="" title="" id="24" name="Picture"/>
             <a:graphic>
@@ -1521,7 +1521,7 @@
                   <pic:spPr bwMode="auto">
                     <a:xfrm>
                       <a:off x="0" y="0"/>
-                      <a:ext cx="5334000" cy="4454932"/>
+                      <a:ext cx="5334000" cy="4467411"/>
                     </a:xfrm>
                     <a:prstGeom prst="rect">
                       <a:avLst/>
@@ -1589,7 +1589,7 @@
       <w:r>
         <w:drawing>
           <wp:inline>
-            <wp:extent cx="5334000" cy="3333750"/>
+            <wp:extent cx="5334000" cy="3239030"/>
             <wp:effectExtent b="0" l="0" r="0" t="0"/>
             <wp:docPr descr="" title="" id="28" name="Picture"/>
             <a:graphic>
@@ -1610,7 +1610,7 @@
                   <pic:spPr bwMode="auto">
                     <a:xfrm>
                       <a:off x="0" y="0"/>
-                      <a:ext cx="5334000" cy="3333750"/>
+                      <a:ext cx="5334000" cy="3239030"/>
                     </a:xfrm>
                     <a:prstGeom prst="rect">
                       <a:avLst/>
@@ -1848,7 +1848,7 @@
       <w:r>
         <w:drawing>
           <wp:inline>
-            <wp:extent cx="5334000" cy="3333750"/>
+            <wp:extent cx="5334000" cy="3239030"/>
             <wp:effectExtent b="0" l="0" r="0" t="0"/>
             <wp:docPr descr="" title="" id="31" name="Picture"/>
             <a:graphic>
@@ -1869,7 +1869,7 @@
                   <pic:spPr bwMode="auto">
                     <a:xfrm>
                       <a:off x="0" y="0"/>
-                      <a:ext cx="5334000" cy="3333750"/>
+                      <a:ext cx="5334000" cy="3239030"/>
                     </a:xfrm>
                     <a:prstGeom prst="rect">
                       <a:avLst/>
@@ -1940,7 +1940,7 @@
       <w:r>
         <w:drawing>
           <wp:inline>
-            <wp:extent cx="5334000" cy="3333750"/>
+            <wp:extent cx="5334000" cy="3239030"/>
             <wp:effectExtent b="0" l="0" r="0" t="0"/>
             <wp:docPr descr="" title="" id="35" name="Picture"/>
             <a:graphic>
@@ -1961,7 +1961,7 @@
                   <pic:spPr bwMode="auto">
                     <a:xfrm>
                       <a:off x="0" y="0"/>
-                      <a:ext cx="5334000" cy="3333750"/>
+                      <a:ext cx="5334000" cy="3239030"/>
                     </a:xfrm>
                     <a:prstGeom prst="rect">
                       <a:avLst/>
@@ -2103,7 +2103,7 @@
       <w:r>
         <w:drawing>
           <wp:inline>
-            <wp:extent cx="5334000" cy="3333750"/>
+            <wp:extent cx="5334000" cy="3239030"/>
             <wp:effectExtent b="0" l="0" r="0" t="0"/>
             <wp:docPr descr="" title="" id="38" name="Picture"/>
             <a:graphic>
@@ -2124,7 +2124,7 @@
                   <pic:spPr bwMode="auto">
                     <a:xfrm>
                       <a:off x="0" y="0"/>
-                      <a:ext cx="5334000" cy="3333750"/>
+                      <a:ext cx="5334000" cy="3239030"/>
                     </a:xfrm>
                     <a:prstGeom prst="rect">
                       <a:avLst/>
@@ -2214,7 +2214,7 @@
       <w:r>
         <w:drawing>
           <wp:inline>
-            <wp:extent cx="5334000" cy="3333750"/>
+            <wp:extent cx="5334000" cy="3239030"/>
             <wp:effectExtent b="0" l="0" r="0" t="0"/>
             <wp:docPr descr="" title="" id="42" name="Picture"/>
             <a:graphic>
@@ -2235,7 +2235,7 @@
                   <pic:spPr bwMode="auto">
                     <a:xfrm>
                       <a:off x="0" y="0"/>
-                      <a:ext cx="5334000" cy="3333750"/>
+                      <a:ext cx="5334000" cy="3239030"/>
                     </a:xfrm>
                     <a:prstGeom prst="rect">
                       <a:avLst/>
@@ -2325,7 +2325,7 @@
       <w:r>
         <w:drawing>
           <wp:inline>
-            <wp:extent cx="5334000" cy="3333750"/>
+            <wp:extent cx="5334000" cy="3239030"/>
             <wp:effectExtent b="0" l="0" r="0" t="0"/>
             <wp:docPr descr="" title="" id="46" name="Picture"/>
             <a:graphic>
@@ -2346,7 +2346,7 @@
                   <pic:spPr bwMode="auto">
                     <a:xfrm>
                       <a:off x="0" y="0"/>
-                      <a:ext cx="5334000" cy="3333750"/>
+                      <a:ext cx="5334000" cy="3239030"/>
                     </a:xfrm>
                     <a:prstGeom prst="rect">
                       <a:avLst/>
@@ -2427,7 +2427,7 @@
       <w:r>
         <w:drawing>
           <wp:inline>
-            <wp:extent cx="5334000" cy="3333750"/>
+            <wp:extent cx="5334000" cy="3239030"/>
             <wp:effectExtent b="0" l="0" r="0" t="0"/>
             <wp:docPr descr="" title="" id="51" name="Picture"/>
             <a:graphic>
@@ -2448,7 +2448,7 @@
                   <pic:spPr bwMode="auto">
                     <a:xfrm>
                       <a:off x="0" y="0"/>
-                      <a:ext cx="5334000" cy="3333750"/>
+                      <a:ext cx="5334000" cy="3239030"/>
                     </a:xfrm>
                     <a:prstGeom prst="rect">
                       <a:avLst/>
@@ -2492,7 +2492,7 @@
       <w:r>
         <w:drawing>
           <wp:inline>
-            <wp:extent cx="5334000" cy="3333750"/>
+            <wp:extent cx="5334000" cy="3239030"/>
             <wp:effectExtent b="0" l="0" r="0" t="0"/>
             <wp:docPr descr="" title="" id="54" name="Picture"/>
             <a:graphic>
@@ -2513,7 +2513,7 @@
                   <pic:spPr bwMode="auto">
                     <a:xfrm>
                       <a:off x="0" y="0"/>
-                      <a:ext cx="5334000" cy="3333750"/>
+                      <a:ext cx="5334000" cy="3239030"/>
                     </a:xfrm>
                     <a:prstGeom prst="rect">
                       <a:avLst/>

</xml_diff>